<commit_message>
change scene show and hide method using
</commit_message>
<xml_diff>
--- a/ReleaseNotes_4.2/ReleaseNotes.docx
+++ b/ReleaseNotes_4.2/ReleaseNotes.docx
@@ -184,7 +184,10 @@
     <w:p/>
     <w:p/>
     <w:p/>
-    <w:p/>
+    <w:p>
+      <w:bookmarkStart w:id="0" w:name="_GoBack"/>
+      <w:bookmarkEnd w:id="0"/>
+    </w:p>
     <w:p/>
     <w:p/>
     <w:p/>
@@ -682,8 +685,8 @@
           <w:color w:val="ED7D31" w:themeColor="accent2"/>
         </w:rPr>
       </w:pPr>
-      <w:bookmarkStart w:id="0" w:name="_Toc77681894"/>
-      <w:bookmarkStart w:id="1" w:name="_Toc137642110"/>
+      <w:bookmarkStart w:id="1" w:name="_Toc77681894"/>
+      <w:bookmarkStart w:id="2" w:name="_Toc137642110"/>
       <w:r>
         <w:rPr>
           <w:color w:val="ED7D31" w:themeColor="accent2"/>
@@ -691,8 +694,8 @@
         <w:lastRenderedPageBreak/>
         <w:t>Термины и сокращения</w:t>
       </w:r>
-      <w:bookmarkEnd w:id="0"/>
       <w:bookmarkEnd w:id="1"/>
+      <w:bookmarkEnd w:id="2"/>
     </w:p>
     <w:p/>
     <w:tbl>
@@ -891,7 +894,7 @@
           <w:color w:val="ED7D31" w:themeColor="accent2"/>
         </w:rPr>
       </w:pPr>
-      <w:bookmarkStart w:id="2" w:name="_Toc137642111"/>
+      <w:bookmarkStart w:id="3" w:name="_Toc137642111"/>
       <w:r>
         <w:rPr>
           <w:color w:val="ED7D31" w:themeColor="accent2"/>
@@ -899,7 +902,7 @@
         <w:lastRenderedPageBreak/>
         <w:t>Введение</w:t>
       </w:r>
-      <w:bookmarkEnd w:id="2"/>
+      <w:bookmarkEnd w:id="3"/>
     </w:p>
     <w:p/>
     <w:p>
@@ -964,7 +967,7 @@
           <w:color w:val="ED7D31" w:themeColor="accent2"/>
         </w:rPr>
       </w:pPr>
-      <w:bookmarkStart w:id="3" w:name="_Toc137642112"/>
+      <w:bookmarkStart w:id="4" w:name="_Toc137642112"/>
       <w:r>
         <w:rPr>
           <w:color w:val="ED7D31" w:themeColor="accent2"/>
@@ -972,7 +975,7 @@
         <w:lastRenderedPageBreak/>
         <w:t>Добавления</w:t>
       </w:r>
-      <w:bookmarkEnd w:id="3"/>
+      <w:bookmarkEnd w:id="4"/>
     </w:p>
     <w:p>
       <w:pPr>
@@ -1446,7 +1449,7 @@
           <w:szCs w:val="24"/>
         </w:rPr>
       </w:pPr>
-      <w:bookmarkStart w:id="4" w:name="_Toc137642113"/>
+      <w:bookmarkStart w:id="5" w:name="_Toc137642113"/>
       <w:r>
         <w:rPr>
           <w:color w:val="ED7D31" w:themeColor="accent2"/>
@@ -1455,7 +1458,7 @@
         <w:lastRenderedPageBreak/>
         <w:t>Изменения</w:t>
       </w:r>
-      <w:bookmarkEnd w:id="4"/>
+      <w:bookmarkEnd w:id="5"/>
     </w:p>
     <w:p>
       <w:pPr>
@@ -1671,7 +1674,7 @@
           <w:color w:val="ED7D31" w:themeColor="accent2"/>
         </w:rPr>
       </w:pPr>
-      <w:bookmarkStart w:id="5" w:name="_Toc137642114"/>
+      <w:bookmarkStart w:id="6" w:name="_Toc137642114"/>
       <w:r>
         <w:rPr>
           <w:color w:val="ED7D31" w:themeColor="accent2"/>
@@ -1679,7 +1682,7 @@
         <w:lastRenderedPageBreak/>
         <w:t>Исправления</w:t>
       </w:r>
-      <w:bookmarkEnd w:id="5"/>
+      <w:bookmarkEnd w:id="6"/>
     </w:p>
     <w:p/>
     <w:p>
@@ -1781,8 +1784,6 @@
         </w:rPr>
         <w:t>Исправлены проблемы с визуализацией при скрытии части модели</w:t>
       </w:r>
-      <w:bookmarkStart w:id="6" w:name="_GoBack"/>
-      <w:bookmarkEnd w:id="6"/>
     </w:p>
     <w:p>
       <w:pPr>
@@ -1921,7 +1922,7 @@
           <w:rPr>
             <w:noProof/>
           </w:rPr>
-          <w:t>6</w:t>
+          <w:t>2</w:t>
         </w:r>
         <w:r>
           <w:fldChar w:fldCharType="end"/>
@@ -4021,7 +4022,7 @@
 </file>
 
 <file path=customXml/itemProps1.xml><?xml version="1.0" encoding="utf-8"?>
-<ds:datastoreItem xmlns:ds="http://schemas.openxmlformats.org/officeDocument/2006/customXml" ds:itemID="{CC3DD83A-CEDA-4140-B942-1BD4064F1F22}">
+<ds:datastoreItem xmlns:ds="http://schemas.openxmlformats.org/officeDocument/2006/customXml" ds:itemID="{B1D32FD6-96CC-4224-803A-39857954B521}">
   <ds:schemaRefs>
     <ds:schemaRef ds:uri="http://schemas.openxmlformats.org/officeDocument/2006/bibliography"/>
   </ds:schemaRefs>

</xml_diff>